<commit_message>
Complete lab 4 SQL application and report
</commit_message>
<xml_diff>
--- a/Основы Разработки Баз Данных/Lab4/Video hosting content management Report4.docx
+++ b/Основы Разработки Баз Данных/Lab4/Video hosting content management Report4.docx
@@ -1148,7 +1148,31 @@
         <w:pStyle w:val="a4"/>
       </w:pPr>
       <w:r>
-        <w:t>Этот документ является шаблоном отчёта по ОС ТУСУР 01-2021 для лабораторных работ. В нём заранее настроены основные стили: основной текст, заголовки, подписи к рисункам, таблицы, обычные и многоуровневые списки.</w:t>
+        <w:t xml:space="preserve">Лабораторная работа посвящена использованию операторов языка SQL в приложении </w:t>
+      </w:r>
+      <w:proofErr w:type="spellStart"/>
+      <w:r>
+        <w:t>Microsoft</w:t>
+      </w:r>
+      <w:proofErr w:type="spellEnd"/>
+      <w:r>
+        <w:t xml:space="preserve"> </w:t>
+      </w:r>
+      <w:proofErr w:type="spellStart"/>
+      <w:r>
+        <w:t>Visual</w:t>
+      </w:r>
+      <w:proofErr w:type="spellEnd"/>
+      <w:r>
+        <w:t xml:space="preserve"> </w:t>
+      </w:r>
+      <w:proofErr w:type="spellStart"/>
+      <w:r>
+        <w:t>Studio</w:t>
+      </w:r>
+      <w:proofErr w:type="spellEnd"/>
+      <w:r>
+        <w:t xml:space="preserve"> для базы данных видеохостинга. В работе рассмотрены выборка данных, фильтрация, объединение таблиц, группировка, агрегатные функции, подзапросы и операции изменения данных.</w:t>
       </w:r>
     </w:p>
     <w:p>
@@ -1156,15 +1180,31 @@
         <w:pStyle w:val="a4"/>
       </w:pPr>
       <w:r>
-        <w:t xml:space="preserve">Перед началом работы рекомендуется заменить </w:t>
+        <w:t xml:space="preserve">Целью лабораторной работы является изучение формирования и выполнения SQL-запросов в приложении </w:t>
       </w:r>
       <w:proofErr w:type="spellStart"/>
       <w:r>
-        <w:t>плейсхолдеры</w:t>
+        <w:t>Microsoft</w:t>
       </w:r>
       <w:proofErr w:type="spellEnd"/>
       <w:r>
-        <w:t xml:space="preserve"> на титульном листе: название лабораторной работы, её номер, название дисциплины, должность, фамилию, имя и отчество преподавателя. После этого пояснительный текст можно удалить и заменить содержательными разделами отчёта.</w:t>
+        <w:t xml:space="preserve"> </w:t>
+      </w:r>
+      <w:proofErr w:type="spellStart"/>
+      <w:r>
+        <w:t>Visual</w:t>
+      </w:r>
+      <w:proofErr w:type="spellEnd"/>
+      <w:r>
+        <w:t xml:space="preserve"> </w:t>
+      </w:r>
+      <w:proofErr w:type="spellStart"/>
+      <w:r>
+        <w:t>Studio</w:t>
+      </w:r>
+      <w:proofErr w:type="spellEnd"/>
+      <w:r>
+        <w:t xml:space="preserve"> для базы данных видеохостинга.</w:t>
       </w:r>
     </w:p>
     <w:p>
@@ -1172,124 +1212,1178 @@
         <w:pStyle w:val="a4"/>
       </w:pPr>
       <w:r>
-        <w:t xml:space="preserve">Основной текст оформляется стилем «Текст ОС ТУСУР»: шрифт </w:t>
-      </w:r>
-      <w:proofErr w:type="spellStart"/>
-      <w:r>
-        <w:t>Times</w:t>
-      </w:r>
-      <w:proofErr w:type="spellEnd"/>
-      <w:r>
+        <w:t>Задачами лабораторной работы являются:</w:t>
+      </w:r>
+    </w:p>
+    <w:p>
+      <w:pPr>
+        <w:pStyle w:val="a1"/>
+      </w:pPr>
+      <w:r>
+        <w:t>выполнить выборку данных из одной таблицы предметной области;</w:t>
+      </w:r>
+    </w:p>
+    <w:p>
+      <w:pPr>
+        <w:pStyle w:val="a1"/>
+      </w:pPr>
+      <w:r>
+        <w:t>сформировать выборку с условиями WHERE и параметрами разных типов данных;</w:t>
+      </w:r>
+    </w:p>
+    <w:p>
+      <w:pPr>
+        <w:pStyle w:val="a1"/>
+      </w:pPr>
+      <w:r>
+        <w:t>получить данные из нескольких связанных таблиц с использованием JOIN;</w:t>
+      </w:r>
+    </w:p>
+    <w:p>
+      <w:pPr>
+        <w:pStyle w:val="a1"/>
+      </w:pPr>
+      <w:r>
+        <w:t>применить агрегатные функции COUNT, AVG, MIN и MAX;</w:t>
+      </w:r>
+    </w:p>
+    <w:p>
+      <w:pPr>
+        <w:pStyle w:val="a1"/>
+        <w:rPr>
+          <w:lang w:val="en-US"/>
+        </w:rPr>
+      </w:pPr>
+      <w:r>
+        <w:t>составить</w:t>
+      </w:r>
+      <w:r>
+        <w:rPr>
+          <w:lang w:val="en-US"/>
+        </w:rPr>
         <w:t xml:space="preserve"> </w:t>
       </w:r>
-      <w:proofErr w:type="spellStart"/>
-      <w:r>
-        <w:t>New</w:t>
-      </w:r>
-      <w:proofErr w:type="spellEnd"/>
-      <w:r>
+      <w:r>
+        <w:t>полный</w:t>
+      </w:r>
+      <w:r>
+        <w:rPr>
+          <w:lang w:val="en-US"/>
+        </w:rPr>
         <w:t xml:space="preserve"> </w:t>
       </w:r>
-      <w:proofErr w:type="spellStart"/>
-      <w:r>
-        <w:t>Roman</w:t>
-      </w:r>
-      <w:proofErr w:type="spellEnd"/>
-      <w:r>
-        <w:t xml:space="preserve">, размер 14 </w:t>
-      </w:r>
-      <w:proofErr w:type="spellStart"/>
-      <w:r>
-        <w:t>пт</w:t>
-      </w:r>
-      <w:proofErr w:type="spellEnd"/>
-      <w:r>
-        <w:t>, межстрочный интервал 1,5, абзацный отступ 1,25 см, выравнивание по ширине. Для заголовков не установлен автоматический интервал после абзаца, поэтому пустую строку после заголовка можно удалить при необходимости.</w:t>
+      <w:r>
+        <w:t>запрос</w:t>
+      </w:r>
+      <w:r>
+        <w:rPr>
+          <w:lang w:val="en-US"/>
+        </w:rPr>
+        <w:t xml:space="preserve"> SELECT </w:t>
+      </w:r>
+      <w:r>
+        <w:t>с</w:t>
+      </w:r>
+      <w:r>
+        <w:rPr>
+          <w:lang w:val="en-US"/>
+        </w:rPr>
+        <w:t xml:space="preserve"> </w:t>
+      </w:r>
+      <w:r>
+        <w:t>предложениями</w:t>
+      </w:r>
+      <w:r>
+        <w:rPr>
+          <w:lang w:val="en-US"/>
+        </w:rPr>
+        <w:t xml:space="preserve"> SELECT, FROM, WHERE, GROUP BY, HAVING </w:t>
+      </w:r>
+      <w:r>
+        <w:t>и</w:t>
+      </w:r>
+      <w:r>
+        <w:rPr>
+          <w:lang w:val="en-US"/>
+        </w:rPr>
+        <w:t xml:space="preserve"> ORDER BY;</w:t>
+      </w:r>
+    </w:p>
+    <w:p>
+      <w:pPr>
+        <w:pStyle w:val="a1"/>
+      </w:pPr>
+      <w:r>
+        <w:t>подготовить и проверить некоррелированный, коррелированный и скалярный подзапросы;</w:t>
+      </w:r>
+    </w:p>
+    <w:p>
+      <w:pPr>
+        <w:pStyle w:val="a1"/>
+      </w:pPr>
+      <w:r>
+        <w:t>реализовать параметрические операции INSERT, UPDATE и DELETE;</w:t>
+      </w:r>
+    </w:p>
+    <w:p>
+      <w:pPr>
+        <w:pStyle w:val="a1"/>
+      </w:pPr>
+      <w:r>
+        <w:t>проверить корректность входных параметров и обработку ошибок выполнения SQL-запросов;</w:t>
+      </w:r>
+    </w:p>
+    <w:p>
+      <w:pPr>
+        <w:pStyle w:val="a1"/>
+      </w:pPr>
+      <w:r>
+        <w:t>протестировать полученные запросы и зафиксировать результаты их выполнения.</w:t>
+      </w:r>
+    </w:p>
+    <w:p>
+      <w:r>
+        <w:br w:type="page"/>
+      </w:r>
+    </w:p>
+    <w:p>
+      <w:pPr>
+        <w:pStyle w:val="12"/>
+      </w:pPr>
+      <w:r>
+        <w:lastRenderedPageBreak/>
+        <w:t>3 КРАТКИЕ ТЕОРЕТИЧЕСКИЕ СВЕДЕНИЯ</w:t>
       </w:r>
     </w:p>
     <w:p>
       <w:pPr>
         <w:pStyle w:val="a4"/>
       </w:pPr>
-      <w:r>
-        <w:t>Рисунки следует оформлять с подписями вида «Рисунок 1.1 – Название рисунка». Подпись размещается под изображением и выравнивается по центру. Между рисунком и его подписью устанавливается одинарный межстрочный интервал 1,0. Если между рисунками используется пустая строка, для неё также следует установить межстрочный интервал 1,0. Между рисунком с подписью и последующим текстом отчёта пустая строка оформляется с межстрочным интервалом 1,5.</w:t>
+    </w:p>
+    <w:p>
+      <w:pPr>
+        <w:pStyle w:val="a4"/>
+      </w:pPr>
+      <w:r>
+        <w:t>Оператор SELECT используется для получения строк из одной или нескольких таблиц. Предложение WHERE ограничивает результат по условию, ORDER BY задаёт порядок сортировки, а GROUP BY объединяет строки в группы для последующего применения агрегатных функций. Предложение HAVING фильтрует уже сформированные группы.</w:t>
+      </w:r>
+    </w:p>
+    <w:p>
+      <w:pPr>
+        <w:pStyle w:val="a4"/>
+      </w:pPr>
+      <w:r>
+        <w:t>Операторы INSERT, UPDATE и DELETE относятся к языку манипулирования данными. В параметрических запросах значения передаются отдельно от текста SQL-команды. Такой подход позволяет проверять типы параметров и не включать пользовательский ввод непосредственно в строку запроса.</w:t>
+      </w:r>
+    </w:p>
+    <w:p>
+      <w:pPr>
+        <w:pStyle w:val="a4"/>
+      </w:pPr>
+      <w:r>
+        <w:t>Подзапрос IN возвращает набор значений для проверки принадлежности, EXISTS проверяет наличие связанной строки, а скалярный подзапрос возвращает одно значение, например средний год выпуска.</w:t>
+      </w:r>
+    </w:p>
+    <w:p>
+      <w:r>
+        <w:br w:type="page"/>
+      </w:r>
+    </w:p>
+    <w:p>
+      <w:pPr>
+        <w:pStyle w:val="12"/>
+      </w:pPr>
+      <w:r>
+        <w:lastRenderedPageBreak/>
+        <w:t>4 ХОД ВЫПОЛНЕНИЯ РАБОТЫ</w:t>
       </w:r>
     </w:p>
     <w:p>
       <w:pPr>
         <w:pStyle w:val="a4"/>
         <w:rPr>
+          <w:lang w:eastAsia="ru-RU"/>
+        </w:rPr>
+      </w:pPr>
+    </w:p>
+    <w:p>
+      <w:pPr>
+        <w:pStyle w:val="2"/>
+      </w:pPr>
+      <w:r>
+        <w:t>4.1 Выборка из одной таблицы</w:t>
+      </w:r>
+    </w:p>
+    <w:p>
+      <w:pPr>
+        <w:pStyle w:val="a4"/>
+      </w:pPr>
+    </w:p>
+    <w:p>
+      <w:pPr>
+        <w:pStyle w:val="a4"/>
+      </w:pPr>
+      <w:r>
+        <w:t>Первый запрос выбирает идентификатор, название, оригинальное название, год выпуска, страну производства и тип контента из таблицы «Контент». Результат отсортирован по названию.</w:t>
+      </w:r>
+    </w:p>
+    <w:p>
+      <w:pPr>
+        <w:pStyle w:val="a4"/>
+      </w:pPr>
+      <w:r>
+        <w:t>Результат выполнения запроса представлен на рисунке 4.1.</w:t>
+      </w:r>
+    </w:p>
+    <w:p>
+      <w:pPr>
+        <w:spacing w:line="240" w:lineRule="auto"/>
+        <w:jc w:val="center"/>
+      </w:pPr>
+      <w:r>
+        <w:rPr>
+          <w:noProof/>
+        </w:rPr>
+        <w:drawing>
+          <wp:inline distT="0" distB="0" distL="0" distR="0" wp14:anchorId="42A45E4A" wp14:editId="36C201F8">
+            <wp:extent cx="5200000" cy="3627765"/>
+            <wp:effectExtent l="0" t="0" r="0" b="0"/>
+            <wp:docPr id="101" name="ЛР4 рисунок 1"/>
+            <wp:cNvGraphicFramePr/>
+            <a:graphic xmlns:a="http://schemas.openxmlformats.org/drawingml/2006/main">
+              <a:graphicData uri="http://schemas.openxmlformats.org/drawingml/2006/picture">
+                <pic:pic xmlns:pic="http://schemas.openxmlformats.org/drawingml/2006/picture">
+                  <pic:nvPicPr>
+                    <pic:cNvPr id="101" name="lab4-01.png"/>
+                    <pic:cNvPicPr/>
+                  </pic:nvPicPr>
+                  <pic:blipFill>
+                    <a:blip r:embed="rId8"/>
+                    <a:stretch>
+                      <a:fillRect/>
+                    </a:stretch>
+                  </pic:blipFill>
+                  <pic:spPr>
+                    <a:xfrm>
+                      <a:off x="0" y="0"/>
+                      <a:ext cx="5200000" cy="3627765"/>
+                    </a:xfrm>
+                    <a:prstGeom prst="rect">
+                      <a:avLst/>
+                    </a:prstGeom>
+                  </pic:spPr>
+                </pic:pic>
+              </a:graphicData>
+            </a:graphic>
+          </wp:inline>
+        </w:drawing>
+      </w:r>
+    </w:p>
+    <w:p>
+      <w:pPr>
+        <w:pStyle w:val="af7"/>
+      </w:pPr>
+      <w:r>
+        <w:rPr>
+          <w:i w:val="0"/>
+          <w:color w:val="000000"/>
+        </w:rPr>
+        <w:t>Рисунок 4.1 – Форма SELECT и результат выборки контента</w:t>
+      </w:r>
+    </w:p>
+    <w:p>
+      <w:pPr>
+        <w:pStyle w:val="a4"/>
+      </w:pPr>
+    </w:p>
+    <w:p>
+      <w:pPr>
+        <w:rPr>
+          <w:rFonts w:ascii="Times New Roman" w:eastAsiaTheme="majorEastAsia" w:hAnsi="Times New Roman" w:cstheme="majorBidi"/>
           <w:b/>
+          <w:sz w:val="28"/>
+          <w:szCs w:val="28"/>
         </w:rPr>
       </w:pPr>
       <w:r>
-        <w:t xml:space="preserve">Для таблиц подготовлен отдельный стиль: шрифт </w:t>
+        <w:br w:type="page"/>
+      </w:r>
+    </w:p>
+    <w:p>
+      <w:pPr>
+        <w:pStyle w:val="2"/>
+      </w:pPr>
+      <w:r>
+        <w:lastRenderedPageBreak/>
+        <w:t>4.2 Выборка с условиями и параметрами</w:t>
+      </w:r>
+    </w:p>
+    <w:p>
+      <w:pPr>
+        <w:pStyle w:val="a4"/>
+      </w:pPr>
+    </w:p>
+    <w:p>
+      <w:pPr>
+        <w:pStyle w:val="a4"/>
+      </w:pPr>
+      <w:r>
+        <w:t>Поиск по названию выполняется в той же форме в режиме SELECT. Пользователь вводит полное название или его часть, после чего приложение возвращает подходящие записи. В SQL-файле дополнительно предусмотрены параметры минимального года выпуска и даты поступления для расширенной проверки условий WHERE.</w:t>
+      </w:r>
+    </w:p>
+    <w:p>
+      <w:pPr>
+        <w:pStyle w:val="a4"/>
+      </w:pPr>
+      <w:r>
+        <w:t>Поиск по названию проверен в режиме SELECT. В одном общем скриншоте формы показаны режим SELECT, выбранный запрос и результат выборки; отдельный рисунок для этого действия не приводится.</w:t>
+      </w:r>
+    </w:p>
+    <w:p>
+      <w:pPr>
+        <w:pStyle w:val="a4"/>
+      </w:pPr>
+    </w:p>
+    <w:p>
+      <w:pPr>
+        <w:rPr>
+          <w:rFonts w:ascii="Times New Roman" w:eastAsiaTheme="majorEastAsia" w:hAnsi="Times New Roman" w:cstheme="majorBidi"/>
+          <w:b/>
+          <w:sz w:val="28"/>
+          <w:szCs w:val="28"/>
+        </w:rPr>
+      </w:pPr>
+      <w:r>
+        <w:br w:type="page"/>
+      </w:r>
+    </w:p>
+    <w:p>
+      <w:pPr>
+        <w:pStyle w:val="2"/>
+      </w:pPr>
+      <w:r>
+        <w:lastRenderedPageBreak/>
+        <w:t>4.3 Объединение нескольких таблиц</w:t>
+      </w:r>
+    </w:p>
+    <w:p>
+      <w:pPr>
+        <w:pStyle w:val="a4"/>
+      </w:pPr>
+    </w:p>
+    <w:p>
+      <w:pPr>
+        <w:pStyle w:val="a4"/>
+      </w:pPr>
+      <w:r>
+        <w:t>Для получения названий жанров используется внутреннее объединение таблиц «Контент», «</w:t>
       </w:r>
       <w:proofErr w:type="spellStart"/>
       <w:r>
-        <w:t>Times</w:t>
+        <w:t>Контент_Жанр</w:t>
       </w:r>
       <w:proofErr w:type="spellEnd"/>
       <w:r>
-        <w:t xml:space="preserve"> </w:t>
-      </w:r>
-      <w:proofErr w:type="spellStart"/>
-      <w:r>
-        <w:t>New</w:t>
-      </w:r>
-      <w:proofErr w:type="spellEnd"/>
-      <w:r>
-        <w:t xml:space="preserve"> </w:t>
-      </w:r>
-      <w:proofErr w:type="spellStart"/>
-      <w:r>
-        <w:t>Roman</w:t>
-      </w:r>
-      <w:proofErr w:type="spellEnd"/>
-      <w:r>
-        <w:t xml:space="preserve">, размер 12 </w:t>
-      </w:r>
-      <w:proofErr w:type="spellStart"/>
-      <w:r>
-        <w:t>пт</w:t>
-      </w:r>
-      <w:proofErr w:type="spellEnd"/>
-      <w:r>
-        <w:t>, одинарный межстрочный интервал и отсутствие абзацного отступа.</w:t>
-      </w:r>
-    </w:p>
-    <w:p>
-      <w:pPr>
-        <w:pStyle w:val="12"/>
-      </w:pPr>
-      <w:r>
-        <w:t>Заключение</w:t>
-      </w:r>
-    </w:p>
-    <w:p>
-      <w:pPr>
-        <w:pStyle w:val="a4"/>
-      </w:pPr>
-    </w:p>
-    <w:p>
-      <w:pPr>
-        <w:pStyle w:val="a4"/>
-      </w:pPr>
-      <w:r>
-        <w:t xml:space="preserve">Шаблон предназначен для переноса единых стилей между отчётами без ручной настройки каждого нового документа. Его можно использовать как </w:t>
-      </w:r>
-      <w:r>
-        <w:lastRenderedPageBreak/>
-        <w:t>основу: открыть шаблон, создать новый документ, заменить титульные данные и заполнить содержательную часть отчёта</w:t>
+        <w:t xml:space="preserve">» и </w:t>
       </w:r>
       <w:bookmarkStart w:id="3" w:name="_GoBack"/>
       <w:bookmarkEnd w:id="3"/>
       <w:r>
-        <w:t>.</w:t>
+        <w:t>«Жанр». Промежуточная таблица обеспечивает связь многие-ко-многим между контентом и жанрами.</w:t>
+      </w:r>
+    </w:p>
+    <w:p>
+      <w:pPr>
+        <w:pStyle w:val="a4"/>
+      </w:pPr>
+      <w:r>
+        <w:t>Результат объединения связанных таблиц представлен на рисунке 4.2.</w:t>
+      </w:r>
+    </w:p>
+    <w:p>
+      <w:pPr>
+        <w:spacing w:line="240" w:lineRule="auto"/>
+        <w:jc w:val="center"/>
+      </w:pPr>
+      <w:r>
+        <w:rPr>
+          <w:noProof/>
+        </w:rPr>
+        <w:drawing>
+          <wp:inline distT="0" distB="0" distL="0" distR="0" wp14:anchorId="5EA06D0C" wp14:editId="4B844185">
+            <wp:extent cx="5200000" cy="3627765"/>
+            <wp:effectExtent l="0" t="0" r="0" b="0"/>
+            <wp:docPr id="103" name="ЛР4 рисунок 3"/>
+            <wp:cNvGraphicFramePr/>
+            <a:graphic xmlns:a="http://schemas.openxmlformats.org/drawingml/2006/main">
+              <a:graphicData uri="http://schemas.openxmlformats.org/drawingml/2006/picture">
+                <pic:pic xmlns:pic="http://schemas.openxmlformats.org/drawingml/2006/picture">
+                  <pic:nvPicPr>
+                    <pic:cNvPr id="103" name="lab4-03.png"/>
+                    <pic:cNvPicPr/>
+                  </pic:nvPicPr>
+                  <pic:blipFill>
+                    <a:blip r:embed="rId9"/>
+                    <a:stretch>
+                      <a:fillRect/>
+                    </a:stretch>
+                  </pic:blipFill>
+                  <pic:spPr>
+                    <a:xfrm>
+                      <a:off x="0" y="0"/>
+                      <a:ext cx="5200000" cy="3627765"/>
+                    </a:xfrm>
+                    <a:prstGeom prst="rect">
+                      <a:avLst/>
+                    </a:prstGeom>
+                  </pic:spPr>
+                </pic:pic>
+              </a:graphicData>
+            </a:graphic>
+          </wp:inline>
+        </w:drawing>
+      </w:r>
+    </w:p>
+    <w:p>
+      <w:pPr>
+        <w:pStyle w:val="af7"/>
+      </w:pPr>
+      <w:r>
+        <w:rPr>
+          <w:i w:val="0"/>
+          <w:color w:val="000000"/>
+        </w:rPr>
+        <w:t>Рисунок 4.2 – Результат объединения таблиц «Контент» и «Жанр»</w:t>
+      </w:r>
+    </w:p>
+    <w:p>
+      <w:pPr>
+        <w:pStyle w:val="a4"/>
+      </w:pPr>
+    </w:p>
+    <w:p>
+      <w:pPr>
+        <w:rPr>
+          <w:rFonts w:ascii="Times New Roman" w:eastAsiaTheme="majorEastAsia" w:hAnsi="Times New Roman" w:cstheme="majorBidi"/>
+          <w:b/>
+          <w:sz w:val="28"/>
+          <w:szCs w:val="28"/>
+        </w:rPr>
+      </w:pPr>
+      <w:r>
+        <w:br w:type="page"/>
+      </w:r>
+    </w:p>
+    <w:p>
+      <w:pPr>
+        <w:pStyle w:val="2"/>
+      </w:pPr>
+      <w:r>
+        <w:lastRenderedPageBreak/>
+        <w:t>4.4 Группировка и сортировка</w:t>
+      </w:r>
+    </w:p>
+    <w:p>
+      <w:pPr>
+        <w:pStyle w:val="a4"/>
+      </w:pPr>
+    </w:p>
+    <w:p>
+      <w:pPr>
+        <w:pStyle w:val="a4"/>
+      </w:pPr>
+      <w:r>
+        <w:t>Запрос группирует контент по стране производства. Для каждой страны вычисляются количество записей, первый и последний год выпуска. Предложение HAVING оставляет непустые группы, а ORDER BY сортирует их по количеству контента.</w:t>
+      </w:r>
+    </w:p>
+    <w:p>
+      <w:pPr>
+        <w:pStyle w:val="a4"/>
+      </w:pPr>
+      <w:r>
+        <w:t>Результат группировки контента по странам представлен на рисунке 4.3.</w:t>
+      </w:r>
+    </w:p>
+    <w:p>
+      <w:pPr>
+        <w:spacing w:line="240" w:lineRule="auto"/>
+        <w:jc w:val="center"/>
+      </w:pPr>
+      <w:r>
+        <w:rPr>
+          <w:noProof/>
+        </w:rPr>
+        <w:drawing>
+          <wp:inline distT="0" distB="0" distL="0" distR="0" wp14:anchorId="2BD27531" wp14:editId="43E6A587">
+            <wp:extent cx="5200000" cy="3627765"/>
+            <wp:effectExtent l="0" t="0" r="0" b="0"/>
+            <wp:docPr id="104" name="ЛР4 рисунок 4"/>
+            <wp:cNvGraphicFramePr/>
+            <a:graphic xmlns:a="http://schemas.openxmlformats.org/drawingml/2006/main">
+              <a:graphicData uri="http://schemas.openxmlformats.org/drawingml/2006/picture">
+                <pic:pic xmlns:pic="http://schemas.openxmlformats.org/drawingml/2006/picture">
+                  <pic:nvPicPr>
+                    <pic:cNvPr id="104" name="lab4-04.png"/>
+                    <pic:cNvPicPr/>
+                  </pic:nvPicPr>
+                  <pic:blipFill>
+                    <a:blip r:embed="rId10"/>
+                    <a:stretch>
+                      <a:fillRect/>
+                    </a:stretch>
+                  </pic:blipFill>
+                  <pic:spPr>
+                    <a:xfrm>
+                      <a:off x="0" y="0"/>
+                      <a:ext cx="5200000" cy="3627765"/>
+                    </a:xfrm>
+                    <a:prstGeom prst="rect">
+                      <a:avLst/>
+                    </a:prstGeom>
+                  </pic:spPr>
+                </pic:pic>
+              </a:graphicData>
+            </a:graphic>
+          </wp:inline>
+        </w:drawing>
+      </w:r>
+    </w:p>
+    <w:p>
+      <w:pPr>
+        <w:pStyle w:val="af7"/>
+      </w:pPr>
+      <w:r>
+        <w:rPr>
+          <w:i w:val="0"/>
+          <w:color w:val="000000"/>
+        </w:rPr>
+        <w:t>Рисунок 4.3 – Результат группировки контента по странам</w:t>
+      </w:r>
+    </w:p>
+    <w:p>
+      <w:pPr>
+        <w:pStyle w:val="a4"/>
+      </w:pPr>
+    </w:p>
+    <w:p>
+      <w:pPr>
+        <w:rPr>
+          <w:rFonts w:ascii="Times New Roman" w:eastAsiaTheme="majorEastAsia" w:hAnsi="Times New Roman" w:cstheme="majorBidi"/>
+          <w:b/>
+          <w:sz w:val="28"/>
+          <w:szCs w:val="28"/>
+        </w:rPr>
+      </w:pPr>
+      <w:r>
+        <w:br w:type="page"/>
+      </w:r>
+    </w:p>
+    <w:p>
+      <w:pPr>
+        <w:pStyle w:val="2"/>
+      </w:pPr>
+      <w:r>
+        <w:lastRenderedPageBreak/>
+        <w:t>4.5 Агрегатные функции</w:t>
+      </w:r>
+    </w:p>
+    <w:p>
+      <w:pPr>
+        <w:pStyle w:val="a4"/>
+      </w:pPr>
+    </w:p>
+    <w:p>
+      <w:pPr>
+        <w:pStyle w:val="a4"/>
+      </w:pPr>
+      <w:r>
+        <w:t>В запросе использованы COUNT, AVG и MIN. Функция COUNT подсчитывает строки и заполненные значения года, AVG вычисляет средний год выпуска, а ISNULL заменяет NULL результат минимального года на ноль.</w:t>
+      </w:r>
+    </w:p>
+    <w:p>
+      <w:pPr>
+        <w:pStyle w:val="a4"/>
+      </w:pPr>
+      <w:r>
+        <w:t>Результат применения агрегатных функций представлен на рисунке 4.4.</w:t>
+      </w:r>
+    </w:p>
+    <w:p>
+      <w:pPr>
+        <w:spacing w:line="240" w:lineRule="auto"/>
+        <w:jc w:val="center"/>
+      </w:pPr>
+      <w:r>
+        <w:rPr>
+          <w:noProof/>
+        </w:rPr>
+        <w:drawing>
+          <wp:inline distT="0" distB="0" distL="0" distR="0" wp14:anchorId="026905E3" wp14:editId="121380C7">
+            <wp:extent cx="5200000" cy="3627765"/>
+            <wp:effectExtent l="0" t="0" r="0" b="0"/>
+            <wp:docPr id="105" name="ЛР4 рисунок 5"/>
+            <wp:cNvGraphicFramePr/>
+            <a:graphic xmlns:a="http://schemas.openxmlformats.org/drawingml/2006/main">
+              <a:graphicData uri="http://schemas.openxmlformats.org/drawingml/2006/picture">
+                <pic:pic xmlns:pic="http://schemas.openxmlformats.org/drawingml/2006/picture">
+                  <pic:nvPicPr>
+                    <pic:cNvPr id="105" name="lab4-05.png"/>
+                    <pic:cNvPicPr/>
+                  </pic:nvPicPr>
+                  <pic:blipFill>
+                    <a:blip r:embed="rId11"/>
+                    <a:stretch>
+                      <a:fillRect/>
+                    </a:stretch>
+                  </pic:blipFill>
+                  <pic:spPr>
+                    <a:xfrm>
+                      <a:off x="0" y="0"/>
+                      <a:ext cx="5200000" cy="3627765"/>
+                    </a:xfrm>
+                    <a:prstGeom prst="rect">
+                      <a:avLst/>
+                    </a:prstGeom>
+                  </pic:spPr>
+                </pic:pic>
+              </a:graphicData>
+            </a:graphic>
+          </wp:inline>
+        </w:drawing>
+      </w:r>
+    </w:p>
+    <w:p>
+      <w:pPr>
+        <w:pStyle w:val="af7"/>
+      </w:pPr>
+      <w:r>
+        <w:rPr>
+          <w:i w:val="0"/>
+          <w:color w:val="000000"/>
+        </w:rPr>
+        <w:t>Рисунок 4.4 – Результат применения агрегатных функций</w:t>
+      </w:r>
+    </w:p>
+    <w:p>
+      <w:pPr>
+        <w:pStyle w:val="a4"/>
+      </w:pPr>
+    </w:p>
+    <w:p>
+      <w:pPr>
+        <w:rPr>
+          <w:rFonts w:ascii="Times New Roman" w:eastAsiaTheme="majorEastAsia" w:hAnsi="Times New Roman" w:cstheme="majorBidi"/>
+          <w:b/>
+          <w:sz w:val="28"/>
+          <w:szCs w:val="28"/>
+        </w:rPr>
+      </w:pPr>
+      <w:r>
+        <w:br w:type="page"/>
+      </w:r>
+    </w:p>
+    <w:p>
+      <w:pPr>
+        <w:pStyle w:val="2"/>
+      </w:pPr>
+      <w:r>
+        <w:lastRenderedPageBreak/>
+        <w:t>4.6 Некоррелированный подзапрос IN</w:t>
+      </w:r>
+    </w:p>
+    <w:p>
+      <w:pPr>
+        <w:pStyle w:val="a4"/>
+      </w:pPr>
+    </w:p>
+    <w:p>
+      <w:pPr>
+        <w:pStyle w:val="a4"/>
+      </w:pPr>
+      <w:r>
+        <w:t>Подзапрос IN выбирает идентификаторы из таблицы «</w:t>
+      </w:r>
+      <w:proofErr w:type="spellStart"/>
+      <w:r>
+        <w:t>Контент_Жанр</w:t>
+      </w:r>
+      <w:proofErr w:type="spellEnd"/>
+      <w:r>
+        <w:t>». Внешний запрос возвращает контент, для которого существует хотя бы одна связь с жанром. Подзапрос не зависит от текущей строки внешнего запроса.</w:t>
+      </w:r>
+    </w:p>
+    <w:p>
+      <w:pPr>
+        <w:pStyle w:val="a4"/>
+      </w:pPr>
+      <w:r>
+        <w:t>Результат выполнения подзапроса IN представлен на рисунке 4.5.</w:t>
+      </w:r>
+    </w:p>
+    <w:p>
+      <w:pPr>
+        <w:spacing w:line="240" w:lineRule="auto"/>
+        <w:jc w:val="center"/>
+      </w:pPr>
+      <w:r>
+        <w:rPr>
+          <w:noProof/>
+        </w:rPr>
+        <w:drawing>
+          <wp:inline distT="0" distB="0" distL="0" distR="0" wp14:anchorId="11400553" wp14:editId="60190004">
+            <wp:extent cx="5200000" cy="3627765"/>
+            <wp:effectExtent l="0" t="0" r="0" b="0"/>
+            <wp:docPr id="106" name="ЛР4 рисунок 6"/>
+            <wp:cNvGraphicFramePr/>
+            <a:graphic xmlns:a="http://schemas.openxmlformats.org/drawingml/2006/main">
+              <a:graphicData uri="http://schemas.openxmlformats.org/drawingml/2006/picture">
+                <pic:pic xmlns:pic="http://schemas.openxmlformats.org/drawingml/2006/picture">
+                  <pic:nvPicPr>
+                    <pic:cNvPr id="106" name="lab4-06.png"/>
+                    <pic:cNvPicPr/>
+                  </pic:nvPicPr>
+                  <pic:blipFill>
+                    <a:blip r:embed="rId12"/>
+                    <a:stretch>
+                      <a:fillRect/>
+                    </a:stretch>
+                  </pic:blipFill>
+                  <pic:spPr>
+                    <a:xfrm>
+                      <a:off x="0" y="0"/>
+                      <a:ext cx="5200000" cy="3627765"/>
+                    </a:xfrm>
+                    <a:prstGeom prst="rect">
+                      <a:avLst/>
+                    </a:prstGeom>
+                  </pic:spPr>
+                </pic:pic>
+              </a:graphicData>
+            </a:graphic>
+          </wp:inline>
+        </w:drawing>
+      </w:r>
+    </w:p>
+    <w:p>
+      <w:pPr>
+        <w:pStyle w:val="af7"/>
+      </w:pPr>
+      <w:r>
+        <w:rPr>
+          <w:i w:val="0"/>
+          <w:color w:val="000000"/>
+        </w:rPr>
+        <w:t>Рисунок 4.5 – Результат выполнения подзапроса IN</w:t>
+      </w:r>
+    </w:p>
+    <w:p>
+      <w:pPr>
+        <w:pStyle w:val="a4"/>
+      </w:pPr>
+    </w:p>
+    <w:p>
+      <w:pPr>
+        <w:rPr>
+          <w:rFonts w:ascii="Times New Roman" w:eastAsiaTheme="majorEastAsia" w:hAnsi="Times New Roman" w:cstheme="majorBidi"/>
+          <w:b/>
+          <w:sz w:val="28"/>
+          <w:szCs w:val="28"/>
+        </w:rPr>
+      </w:pPr>
+      <w:r>
+        <w:br w:type="page"/>
+      </w:r>
+    </w:p>
+    <w:p>
+      <w:pPr>
+        <w:pStyle w:val="2"/>
+      </w:pPr>
+      <w:r>
+        <w:lastRenderedPageBreak/>
+        <w:t>4.7 Коррелированный подзапрос EXISTS</w:t>
+      </w:r>
+    </w:p>
+    <w:p>
+      <w:pPr>
+        <w:pStyle w:val="a4"/>
+      </w:pPr>
+    </w:p>
+    <w:p>
+      <w:pPr>
+        <w:pStyle w:val="a4"/>
+      </w:pPr>
+      <w:r>
+        <w:t xml:space="preserve">Подзапрос EXISTS проверяет наличие </w:t>
+      </w:r>
+      <w:proofErr w:type="spellStart"/>
+      <w:r>
+        <w:t>медиафайла</w:t>
+      </w:r>
+      <w:proofErr w:type="spellEnd"/>
+      <w:r>
+        <w:t xml:space="preserve"> для каждой строки таблицы «Контент». Он связан с внешним запросом условием равенства идентификаторов контента. Совпадение результатов с запросом IN объясняется текущими данными базы.</w:t>
+      </w:r>
+    </w:p>
+    <w:p>
+      <w:pPr>
+        <w:pStyle w:val="a4"/>
+      </w:pPr>
+      <w:r>
+        <w:t>Результат выполнения подзапроса EXISTS представлен на рисунке 4.6.</w:t>
+      </w:r>
+    </w:p>
+    <w:p>
+      <w:pPr>
+        <w:spacing w:line="240" w:lineRule="auto"/>
+        <w:jc w:val="center"/>
+      </w:pPr>
+      <w:r>
+        <w:rPr>
+          <w:noProof/>
+        </w:rPr>
+        <w:drawing>
+          <wp:inline distT="0" distB="0" distL="0" distR="0" wp14:anchorId="3A228281" wp14:editId="58F55BAA">
+            <wp:extent cx="5200000" cy="3627765"/>
+            <wp:effectExtent l="0" t="0" r="0" b="0"/>
+            <wp:docPr id="107" name="ЛР4 рисунок 7"/>
+            <wp:cNvGraphicFramePr/>
+            <a:graphic xmlns:a="http://schemas.openxmlformats.org/drawingml/2006/main">
+              <a:graphicData uri="http://schemas.openxmlformats.org/drawingml/2006/picture">
+                <pic:pic xmlns:pic="http://schemas.openxmlformats.org/drawingml/2006/picture">
+                  <pic:nvPicPr>
+                    <pic:cNvPr id="107" name="lab4-07.png"/>
+                    <pic:cNvPicPr/>
+                  </pic:nvPicPr>
+                  <pic:blipFill>
+                    <a:blip r:embed="rId13"/>
+                    <a:stretch>
+                      <a:fillRect/>
+                    </a:stretch>
+                  </pic:blipFill>
+                  <pic:spPr>
+                    <a:xfrm>
+                      <a:off x="0" y="0"/>
+                      <a:ext cx="5200000" cy="3627765"/>
+                    </a:xfrm>
+                    <a:prstGeom prst="rect">
+                      <a:avLst/>
+                    </a:prstGeom>
+                  </pic:spPr>
+                </pic:pic>
+              </a:graphicData>
+            </a:graphic>
+          </wp:inline>
+        </w:drawing>
+      </w:r>
+    </w:p>
+    <w:p>
+      <w:pPr>
+        <w:pStyle w:val="af7"/>
+      </w:pPr>
+      <w:r>
+        <w:rPr>
+          <w:i w:val="0"/>
+          <w:color w:val="000000"/>
+        </w:rPr>
+        <w:t>Рисунок 4.6 – Результат выполнения подзапроса EXISTS</w:t>
+      </w:r>
+    </w:p>
+    <w:p>
+      <w:pPr>
+        <w:pStyle w:val="a4"/>
+      </w:pPr>
+    </w:p>
+    <w:p>
+      <w:pPr>
+        <w:rPr>
+          <w:rFonts w:ascii="Times New Roman" w:eastAsiaTheme="majorEastAsia" w:hAnsi="Times New Roman" w:cstheme="majorBidi"/>
+          <w:b/>
+          <w:sz w:val="28"/>
+          <w:szCs w:val="28"/>
+        </w:rPr>
+      </w:pPr>
+      <w:r>
+        <w:br w:type="page"/>
+      </w:r>
+    </w:p>
+    <w:p>
+      <w:pPr>
+        <w:pStyle w:val="2"/>
+      </w:pPr>
+      <w:r>
+        <w:lastRenderedPageBreak/>
+        <w:t>4.8 Скалярный подзапрос</w:t>
+      </w:r>
+    </w:p>
+    <w:p>
+      <w:pPr>
+        <w:pStyle w:val="a4"/>
+      </w:pPr>
+    </w:p>
+    <w:p>
+      <w:pPr>
+        <w:pStyle w:val="a4"/>
+      </w:pPr>
+      <w:r>
+        <w:t>Скалярный подзапрос вычисляет средний год выпуска. Внешний запрос показывает контент, выпущенный позже среднего значения. Результат сортируется по году выпуска в порядке убывания.</w:t>
+      </w:r>
+    </w:p>
+    <w:p>
+      <w:pPr>
+        <w:pStyle w:val="a4"/>
+      </w:pPr>
+      <w:r>
+        <w:t>Результат выполнения скалярного подзапроса представлен на рисунке 4.7.</w:t>
+      </w:r>
+    </w:p>
+    <w:p>
+      <w:pPr>
+        <w:spacing w:line="240" w:lineRule="auto"/>
+        <w:jc w:val="center"/>
+      </w:pPr>
+      <w:r>
+        <w:rPr>
+          <w:noProof/>
+        </w:rPr>
+        <w:drawing>
+          <wp:inline distT="0" distB="0" distL="0" distR="0" wp14:anchorId="57CA6990" wp14:editId="0B40AD3B">
+            <wp:extent cx="5200000" cy="3627765"/>
+            <wp:effectExtent l="0" t="0" r="0" b="0"/>
+            <wp:docPr id="108" name="ЛР4 рисунок 8"/>
+            <wp:cNvGraphicFramePr/>
+            <a:graphic xmlns:a="http://schemas.openxmlformats.org/drawingml/2006/main">
+              <a:graphicData uri="http://schemas.openxmlformats.org/drawingml/2006/picture">
+                <pic:pic xmlns:pic="http://schemas.openxmlformats.org/drawingml/2006/picture">
+                  <pic:nvPicPr>
+                    <pic:cNvPr id="108" name="lab4-08.png"/>
+                    <pic:cNvPicPr/>
+                  </pic:nvPicPr>
+                  <pic:blipFill>
+                    <a:blip r:embed="rId14"/>
+                    <a:stretch>
+                      <a:fillRect/>
+                    </a:stretch>
+                  </pic:blipFill>
+                  <pic:spPr>
+                    <a:xfrm>
+                      <a:off x="0" y="0"/>
+                      <a:ext cx="5200000" cy="3627765"/>
+                    </a:xfrm>
+                    <a:prstGeom prst="rect">
+                      <a:avLst/>
+                    </a:prstGeom>
+                  </pic:spPr>
+                </pic:pic>
+              </a:graphicData>
+            </a:graphic>
+          </wp:inline>
+        </w:drawing>
+      </w:r>
+    </w:p>
+    <w:p>
+      <w:pPr>
+        <w:pStyle w:val="af7"/>
+      </w:pPr>
+      <w:r>
+        <w:rPr>
+          <w:i w:val="0"/>
+          <w:color w:val="000000"/>
+        </w:rPr>
+        <w:t>Рисунок 4.7 – Результат выполнения скалярного подзапроса</w:t>
+      </w:r>
+    </w:p>
+    <w:p>
+      <w:pPr>
+        <w:pStyle w:val="a4"/>
+      </w:pPr>
+    </w:p>
+    <w:p>
+      <w:pPr>
+        <w:pStyle w:val="2"/>
+      </w:pPr>
+      <w:r>
+        <w:t>4.9 Операторы INSERT, UPDATE и DELETE</w:t>
+      </w:r>
+    </w:p>
+    <w:p>
+      <w:pPr>
+        <w:pStyle w:val="a4"/>
+      </w:pPr>
+    </w:p>
+    <w:p>
+      <w:pPr>
+        <w:pStyle w:val="a4"/>
+      </w:pPr>
+      <w:r>
+        <w:t>Операции изменения данных объединены в транзакцию. Сначала добавляется тестовая запись контента, затем изменяется её описание и после этого запись удаляется. В конце выполняется ROLLBACK, поэтому учебный прогон не изменяет исходное содержимое базы данных. Параметры проверяются до выполнения INSERT.</w:t>
+      </w:r>
+    </w:p>
+    <w:p>
+      <w:pPr>
+        <w:pStyle w:val="a4"/>
+      </w:pPr>
+      <w:r>
+        <w:lastRenderedPageBreak/>
+        <w:t>Работа операций INSERT, UPDATE и DELETE проверена в приложении. На рисунке 4.8 показан результат выполнения INSERT; UPDATE и DELETE выполняются в тех же режимах с соответствующими параметрами.</w:t>
+      </w:r>
+    </w:p>
+    <w:p>
+      <w:pPr>
+        <w:spacing w:line="240" w:lineRule="auto"/>
+        <w:jc w:val="center"/>
+      </w:pPr>
+      <w:r>
+        <w:rPr>
+          <w:noProof/>
+        </w:rPr>
+        <w:drawing>
+          <wp:inline distT="0" distB="0" distL="0" distR="0" wp14:anchorId="4B4263D6" wp14:editId="4CFCD372">
+            <wp:extent cx="5200000" cy="3627765"/>
+            <wp:effectExtent l="0" t="0" r="0" b="0"/>
+            <wp:docPr id="109" name="ЛР4 рисунок 9"/>
+            <wp:cNvGraphicFramePr/>
+            <a:graphic xmlns:a="http://schemas.openxmlformats.org/drawingml/2006/main">
+              <a:graphicData uri="http://schemas.openxmlformats.org/drawingml/2006/picture">
+                <pic:pic xmlns:pic="http://schemas.openxmlformats.org/drawingml/2006/picture">
+                  <pic:nvPicPr>
+                    <pic:cNvPr id="109" name="lab4-09.png"/>
+                    <pic:cNvPicPr/>
+                  </pic:nvPicPr>
+                  <pic:blipFill>
+                    <a:blip r:embed="rId15"/>
+                    <a:stretch>
+                      <a:fillRect/>
+                    </a:stretch>
+                  </pic:blipFill>
+                  <pic:spPr>
+                    <a:xfrm>
+                      <a:off x="0" y="0"/>
+                      <a:ext cx="5200000" cy="3627765"/>
+                    </a:xfrm>
+                    <a:prstGeom prst="rect">
+                      <a:avLst/>
+                    </a:prstGeom>
+                  </pic:spPr>
+                </pic:pic>
+              </a:graphicData>
+            </a:graphic>
+          </wp:inline>
+        </w:drawing>
+      </w:r>
+    </w:p>
+    <w:p>
+      <w:pPr>
+        <w:pStyle w:val="af7"/>
+      </w:pPr>
+      <w:r>
+        <w:rPr>
+          <w:i w:val="0"/>
+          <w:color w:val="000000"/>
+        </w:rPr>
+        <w:t>Рисунок 4.8 – Результат выполнения INSERT в приложении</w:t>
+      </w:r>
+    </w:p>
+    <w:p>
+      <w:pPr>
+        <w:pStyle w:val="a4"/>
+      </w:pPr>
+    </w:p>
+    <w:p>
+      <w:r>
+        <w:br w:type="page"/>
+      </w:r>
+    </w:p>
+    <w:p>
+      <w:pPr>
+        <w:pStyle w:val="12"/>
+      </w:pPr>
+      <w:r>
+        <w:lastRenderedPageBreak/>
+        <w:t>5 РЕЗУЛЬТАТЫ РАБОТЫ</w:t>
+      </w:r>
+    </w:p>
+    <w:p>
+      <w:pPr>
+        <w:pStyle w:val="a4"/>
+      </w:pPr>
+    </w:p>
+    <w:p>
+      <w:pPr>
+        <w:pStyle w:val="a4"/>
+      </w:pPr>
+      <w:r>
+        <w:t xml:space="preserve">В ходе лабораторной работы подготовлен и выполнен набор SQL-запросов для базы </w:t>
+      </w:r>
+      <w:proofErr w:type="spellStart"/>
+      <w:r>
+        <w:t>VideoHostingDB</w:t>
+      </w:r>
+      <w:proofErr w:type="spellEnd"/>
+      <w:r>
+        <w:t>. Проверены выборки из одной и нескольких таблиц, параметрический поиск, группировка, агрегатные функции и три вида подзапросов. Операции INSERT, UPDATE и DELETE выполнены в транзакции с откатом изменений.</w:t>
+      </w:r>
+    </w:p>
+    <w:p>
+      <w:pPr>
+        <w:pStyle w:val="a4"/>
+      </w:pPr>
+      <w:r>
+        <w:t xml:space="preserve">Параметры запроса имеют разные типы: </w:t>
+      </w:r>
+      <w:proofErr w:type="spellStart"/>
+      <w:r>
+        <w:t>nvarchar</w:t>
+      </w:r>
+      <w:proofErr w:type="spellEnd"/>
+      <w:r>
+        <w:t xml:space="preserve"> для названия, </w:t>
+      </w:r>
+      <w:proofErr w:type="spellStart"/>
+      <w:r>
+        <w:t>smallint</w:t>
+      </w:r>
+      <w:proofErr w:type="spellEnd"/>
+      <w:r>
+        <w:t xml:space="preserve"> для года и </w:t>
+      </w:r>
+      <w:proofErr w:type="spellStart"/>
+      <w:r>
+        <w:t>date</w:t>
+      </w:r>
+      <w:proofErr w:type="spellEnd"/>
+      <w:r>
+        <w:t xml:space="preserve"> для даты поступления. Для ошибочных значений предусмотрены проверки пустого текста и допустимого диапазона года.</w:t>
+      </w:r>
+    </w:p>
+    <w:p>
+      <w:r>
+        <w:br w:type="page"/>
+      </w:r>
+    </w:p>
+    <w:p>
+      <w:pPr>
+        <w:pStyle w:val="12"/>
+      </w:pPr>
+      <w:r>
+        <w:lastRenderedPageBreak/>
+        <w:t>Заключение</w:t>
+      </w:r>
+    </w:p>
+    <w:p>
+      <w:pPr>
+        <w:pStyle w:val="a4"/>
+      </w:pPr>
+    </w:p>
+    <w:p>
+      <w:pPr>
+        <w:pStyle w:val="a4"/>
+      </w:pPr>
+      <w:r>
+        <w:t>В лабораторной работе изучены основные операторы SQL для базы данных видеохостинга. Выполнены выборки, фильтрация, объединение таблиц, группировка, агрегатные функции и подзапросы. Проверены параметрические операции INSERT, UPDATE и DELETE с контролем корректности данных и откатом транзакции.</w:t>
       </w:r>
     </w:p>
     <w:sectPr>
-      <w:footerReference w:type="default" r:id="rId8"/>
+      <w:footerReference w:type="default" r:id="rId16"/>
       <w:pgSz w:w="11906" w:h="16838"/>
       <w:pgMar w:top="1134" w:right="851" w:bottom="1134" w:left="1701" w:header="709" w:footer="709" w:gutter="0"/>
       <w:cols w:space="708"/>
@@ -8519,7 +9613,7 @@
 </file>
 
 <file path=customXml/itemProps1.xml><?xml version="1.0" encoding="utf-8"?>
-<ds:datastoreItem xmlns:ds="http://schemas.openxmlformats.org/officeDocument/2006/customXml" ds:itemID="{6BC51D43-920D-442E-B7EA-DCFA1BC94B20}">
+<ds:datastoreItem xmlns:ds="http://schemas.openxmlformats.org/officeDocument/2006/customXml" ds:itemID="{5BF04840-D039-4ECF-8458-80B090B5240B}">
   <ds:schemaRefs>
     <ds:schemaRef ds:uri="http://schemas.openxmlformats.org/officeDocument/2006/bibliography"/>
   </ds:schemaRefs>

</xml_diff>